<commit_message>
updated for IF Simulation
</commit_message>
<xml_diff>
--- a/docs/lectures/Chapter01_Lecture.docx
+++ b/docs/lectures/Chapter01_Lecture.docx
@@ -23,7 +23,7 @@
         <w:pStyle w:val="Date"/>
       </w:pPr>
       <w:r>
-        <w:t xml:space="preserve">2026-01-14</w:t>
+        <w:t xml:space="preserve">2026-01-18</w:t>
       </w:r>
     </w:p>
     <w:sdt>
@@ -90,7 +90,7 @@
           <w:b/>
           <w:bCs/>
         </w:rPr>
-        <w:t xml:space="preserve">Think about this”</w:t>
+        <w:t xml:space="preserve">Think about this:</w:t>
       </w:r>
       <w:r>
         <w:t xml:space="preserve"> </w:t>
@@ -552,7 +552,7 @@
               <a:graphicData uri="http://schemas.openxmlformats.org/drawingml/2006/picture">
                 <pic:pic>
                   <pic:nvPicPr>
-                    <pic:cNvPr descr="../assets/images/GlobalCapitalMarkets.jpg" id="26" name="Picture"/>
+                    <pic:cNvPr descr="../assets/images/Ch01/GlobalCapitalMarkets.jpg" id="26" name="Picture"/>
                     <pic:cNvPicPr>
                       <a:picLocks noChangeArrowheads="1" noChangeAspect="1"/>
                     </pic:cNvPicPr>
@@ -1002,7 +1002,7 @@
               <a:graphicData uri="http://schemas.openxmlformats.org/drawingml/2006/picture">
                 <pic:pic>
                   <pic:nvPicPr>
-                    <pic:cNvPr descr="../assets/images/Foreign_Currency_Terms.png" id="33" name="Picture"/>
+                    <pic:cNvPr descr="../assets/images/Ch01/Foreign_Currency_Terms.png" id="33" name="Picture"/>
                     <pic:cNvPicPr>
                       <a:picLocks noChangeArrowheads="1" noChangeAspect="1"/>
                     </pic:cNvPicPr>
@@ -1165,7 +1165,7 @@
               <a:graphicData uri="http://schemas.openxmlformats.org/drawingml/2006/picture">
                 <pic:pic>
                   <pic:nvPicPr>
-                    <pic:cNvPr descr="../assets/images/Home_Currency_Terms.png" id="37" name="Picture"/>
+                    <pic:cNvPr descr="../assets/images/Ch01/Home_Currency_Terms.png" id="37" name="Picture"/>
                     <pic:cNvPicPr>
                       <a:picLocks noChangeArrowheads="1" noChangeAspect="1"/>
                     </pic:cNvPicPr>
@@ -1630,7 +1630,7 @@
         </w:numPr>
       </w:pPr>
       <w:r>
-        <w:t xml:space="preserve">A country generally cannot freeze their own currency if it is held in an foreign bank, unless the foreign entity agrees to freeze those assets as well.</w:t>
+        <w:t xml:space="preserve">A country generally cannot freeze the currency of another country if it is held in an foreign bank, unless the foreign entity agrees to freeze those assets as well. For example, the U.S. cannot freeze the assets of Russia if the funds are held in a Belarus bank, unless Belarus agrees to freeze the funds as well.</w:t>
       </w:r>
     </w:p>
     <w:bookmarkEnd w:id="41"/>
@@ -3262,7 +3262,7 @@
               <a:graphicData uri="http://schemas.openxmlformats.org/drawingml/2006/picture">
                 <pic:pic>
                   <pic:nvPicPr>
-                    <pic:cNvPr descr="../assets/images/Exhibit%201.3.png" id="62" name="Picture"/>
+                    <pic:cNvPr descr="../assets/images/Ch01/Exhibit%201.3.png" id="62" name="Picture"/>
                     <pic:cNvPicPr>
                       <a:picLocks noChangeArrowheads="1" noChangeAspect="1"/>
                     </pic:cNvPicPr>
@@ -5318,14 +5318,14 @@
       <w:r>
         <w:drawing>
           <wp:inline>
-            <wp:extent cx="4000500" cy="3008923"/>
+            <wp:extent cx="3200400" cy="2407138"/>
             <wp:effectExtent b="0" l="0" r="0" t="0"/>
             <wp:docPr descr="Initiation of the Globalization Process" title="" id="74" name="Picture"/>
             <a:graphic>
               <a:graphicData uri="http://schemas.openxmlformats.org/drawingml/2006/picture">
                 <pic:pic>
                   <pic:nvPicPr>
-                    <pic:cNvPr descr="../assets/images/Exhibit_1.4.png" id="75" name="Picture"/>
+                    <pic:cNvPr descr="../assets/images/Ch01/Exhibit_1.4.png" id="75" name="Picture"/>
                     <pic:cNvPicPr>
                       <a:picLocks noChangeArrowheads="1" noChangeAspect="1"/>
                     </pic:cNvPicPr>
@@ -5339,7 +5339,7 @@
                   <pic:spPr bwMode="auto">
                     <a:xfrm>
                       <a:off x="0" y="0"/>
-                      <a:ext cx="4000500" cy="3008923"/>
+                      <a:ext cx="3200400" cy="2407138"/>
                     </a:xfrm>
                     <a:prstGeom prst="rect">
                       <a:avLst/>
@@ -5575,14 +5575,14 @@
       <w:r>
         <w:drawing>
           <wp:inline>
-            <wp:extent cx="4000500" cy="3008923"/>
+            <wp:extent cx="3200400" cy="2407138"/>
             <wp:effectExtent b="0" l="0" r="0" t="0"/>
             <wp:docPr descr="Foreign Direct Investment Sequence" title="" id="78" name="Picture"/>
             <a:graphic>
               <a:graphicData uri="http://schemas.openxmlformats.org/drawingml/2006/picture">
                 <pic:pic>
                   <pic:nvPicPr>
-                    <pic:cNvPr descr="../assets/images/Exhibit_1.5.png" id="79" name="Picture"/>
+                    <pic:cNvPr descr="../assets/images/Ch01/Exhibit_1.5.png" id="79" name="Picture"/>
                     <pic:cNvPicPr>
                       <a:picLocks noChangeArrowheads="1" noChangeAspect="1"/>
                     </pic:cNvPicPr>
@@ -5596,7 +5596,7 @@
                   <pic:spPr bwMode="auto">
                     <a:xfrm>
                       <a:off x="0" y="0"/>
-                      <a:ext cx="4000500" cy="3008923"/>
+                      <a:ext cx="3200400" cy="2407138"/>
                     </a:xfrm>
                     <a:prstGeom prst="rect">
                       <a:avLst/>

</xml_diff>